<commit_message>
Fix arithmetic errors in brief worked-example pots
Examples 6, 7, and 8 in the Action History spec had hand-written pot figures that don't sum correctly: Flop $153 -> $152, Flop $475 -> $485, Turn $133 -> $125. The corrected values match the deterministic pot model (blinds + antes + every committed chip), which the other 7 worked examples already confirm. Only word/document.xml changes inside the docx; all other members are byte-identical. Updates the now-stale notes in test_action_history.py.

Co-Authored-By: Claude Opus 4.7 (1M context) <noreply@anthropic.com>
</commit_message>
<xml_diff>
--- a/docs/engineering_brief.docx
+++ b/docs/engineering_brief.docx
@@ -14047,7 +14047,7 @@
         <w:rPr>
           <w:rtl w:val="0"/>
         </w:rPr>
-        <w:t xml:space="preserve">Flop ($153): K❤️7♣️4❤️</w:t>
+        <w:t xml:space="preserve">Flop ($152): K❤️7♣️4❤️</w:t>
       </w:r>
     </w:p>
     <w:p>
@@ -14202,7 +14202,7 @@
         <w:rPr>
           <w:rtl w:val="0"/>
         </w:rPr>
-        <w:t xml:space="preserve">Flop ($475): J♠️J❤️7♣️</w:t>
+        <w:t xml:space="preserve">Flop ($485): J♠️J❤️7♣️</w:t>
       </w:r>
     </w:p>
     <w:p>
@@ -14392,7 +14392,7 @@
         <w:rPr>
           <w:rtl w:val="0"/>
         </w:rPr>
-        <w:t xml:space="preserve">Turn ($133): K♦️</w:t>
+        <w:t xml:space="preserve">Turn ($125): K♦️</w:t>
       </w:r>
     </w:p>
     <w:p>

</xml_diff>